<commit_message>
added swift and iban
</commit_message>
<xml_diff>
--- a/StandardSalesCreditMemoExtended.docx
+++ b/StandardSalesCreditMemoExtended.docx
@@ -2,21 +2,12 @@
 <file path=word/document.xml><?xml version="1.0" encoding="utf-8"?>
 <w:document xmlns:wpc="http://schemas.microsoft.com/office/word/2010/wordprocessingCanvas" xmlns:cx="http://schemas.microsoft.com/office/drawing/2014/chartex" xmlns:cx1="http://schemas.microsoft.com/office/drawing/2015/9/8/chartex" xmlns:cx2="http://schemas.microsoft.com/office/drawing/2015/10/21/chartex" xmlns:cx3="http://schemas.microsoft.com/office/drawing/2016/5/9/chartex" xmlns:cx4="http://schemas.microsoft.com/office/drawing/2016/5/10/chartex" xmlns:cx5="http://schemas.microsoft.com/office/drawing/2016/5/11/chartex" xmlns:cx6="http://schemas.microsoft.com/office/drawing/2016/5/12/chartex" xmlns:cx7="http://schemas.microsoft.com/office/drawing/2016/5/13/chartex" xmlns:cx8="http://schemas.microsoft.com/office/drawing/2016/5/14/chartex" xmlns:mc="http://schemas.openxmlformats.org/markup-compatibility/2006" xmlns:aink="http://schemas.microsoft.com/office/drawing/2016/ink" xmlns:am3d="http://schemas.microsoft.com/office/drawing/2017/model3d" xmlns:o="urn:schemas-microsoft-com:office:office" xmlns:r="http://schemas.openxmlformats.org/officeDocument/2006/relationships" xmlns:m="http://schemas.openxmlformats.org/officeDocument/2006/math" xmlns:v="urn:schemas-microsoft-com:vml" xmlns:wp14="http://schemas.microsoft.com/office/word/2010/wordprocessingDrawing" xmlns:wp="http://schemas.openxmlformats.org/drawingml/2006/wordprocessingDrawing" xmlns:w10="urn:schemas-microsoft-com:office:word" xmlns:w="http://schemas.openxmlformats.org/wordprocessingml/2006/main" xmlns:w14="http://schemas.microsoft.com/office/word/2010/wordml" xmlns:w15="http://schemas.microsoft.com/office/word/2012/wordml" xmlns:w16cex="http://schemas.microsoft.com/office/word/2018/wordml/cex" xmlns:w16cid="http://schemas.microsoft.com/office/word/2016/wordml/cid" xmlns:w16="http://schemas.microsoft.com/office/word/2018/wordml" xmlns:w16sdtdh="http://schemas.microsoft.com/office/word/2020/wordml/sdtdatahash" xmlns:w16se="http://schemas.microsoft.com/office/word/2015/wordml/symex" xmlns:wpg="http://schemas.microsoft.com/office/word/2010/wordprocessingGroup" xmlns:wpi="http://schemas.microsoft.com/office/word/2010/wordprocessingInk" xmlns:wne="http://schemas.microsoft.com/office/word/2006/wordml" xmlns:wps="http://schemas.microsoft.com/office/word/2010/wordprocessingShape" mc:Ignorable="w14 w15 w16se w16cid w16 w16cex w16sdtdh wp14">
   <w:body>
-    <w:p/>
     <w:p/>
     <w:tbl>
       <w:tblPr>
         <w:tblStyle w:val="Tabel-Gitter"/>
         <w:tblW w:w="10632" w:type="dxa"/>
         <w:tblInd w:w="-431" w:type="dxa"/>
-        <w:tblBorders>
-          <w:top w:val="none" w:color="auto" w:sz="0" w:space="0"/>
-          <w:left w:val="none" w:color="auto" w:sz="0" w:space="0"/>
-          <w:bottom w:val="none" w:color="auto" w:sz="0" w:space="0"/>
-          <w:right w:val="none" w:color="auto" w:sz="0" w:space="0"/>
-          <w:insideH w:val="none" w:color="auto" w:sz="0" w:space="0"/>
-          <w:insideV w:val="none" w:color="auto" w:sz="0" w:space="0"/>
-        </w:tblBorders>
         <w:tblCellMar>
           <w:left w:w="0" w:type="dxa"/>
           <w:right w:w="0" w:type="dxa"/>
@@ -30,8 +21,53 @@
         <w:tc>
           <w:tcPr>
             <w:tcW w:w="10632" w:type="dxa"/>
+            <w:tcBorders>
+              <w:top w:val="nil"/>
+              <w:left w:val="nil"/>
+              <w:bottom w:val="nil"/>
+              <w:right w:val="nil"/>
+            </w:tcBorders>
           </w:tcPr>
           <w:p>
+            <w:pPr>
+              <w:rPr>
+                <w:b/>
+                <w:bCs/>
+              </w:rPr>
+            </w:pPr>
+            <w:sdt>
+              <w:sdtPr>
+                <w:rPr>
+                  <w:b/>
+                  <w:bCs/>
+                </w:rPr>
+                <w:alias w:val="#Nav: /Header/District"/>
+                <w:tag w:val="#Nav: Standard_Sales_Credit_Memo/1307"/>
+                <w:id w:val="1707903407"/>
+                <w:placeholder>
+                  <w:docPart w:val="BB921F93711D447499A05E1D5CA62D39"/>
+                </w:placeholder>
+                <w:dataBinding w:prefixMappings="xmlns:ns0='urn:microsoft-dynamics-nav/reports/Standard_Sales_Credit_Memo/1307/'" w:xpath="/ns0:NavWordReportXmlPart[1]/ns0:Header[1]/ns0:District[1]" w:storeItemID="{CF06288A-A83B-4F49-BD2E-F2144A427321}"/>
+                <w:text/>
+              </w:sdtPr>
+              <w:sdtEndPr/>
+              <w:sdtContent>
+                <w:r>
+                  <w:rPr>
+                    <w:b/>
+                    <w:bCs/>
+                  </w:rPr>
+                  <w:t>District</w:t>
+                </w:r>
+              </w:sdtContent>
+            </w:sdt>
+            <w:r>
+              <w:rPr>
+                <w:b/>
+                <w:bCs/>
+              </w:rPr>
+              <w:t xml:space="preserve">  -  </w:t>
+            </w:r>
             <w:sdt>
               <w:sdtPr>
                 <w:rPr>
@@ -40,7 +76,7 @@
                 </w:rPr>
                 <w:alias w:val="#Nav: /Header/DocumentTitle_Lbl"/>
                 <w:tag w:val="#Nav: Standard_Sales_Credit_Memo/1307"/>
-                <w:id w:val="-455867196"/>
+                <w:id w:val="-934290643"/>
                 <w:placeholder>
                   <w:docPart w:val="DefaultPlaceholder_-1854013440"/>
                 </w:placeholder>
@@ -65,7 +101,7 @@
                 <w:b/>
                 <w:bCs/>
               </w:rPr>
-              <w:t xml:space="preserve"> - </w:t>
+              <w:t xml:space="preserve"> </w:t>
             </w:r>
             <w:sdt>
               <w:sdtPr>
@@ -73,24 +109,117 @@
                   <w:b/>
                   <w:bCs/>
                 </w:rPr>
-                <w:alias w:val="#Nav: /Header/District"/>
+                <w:alias w:val="#Nav: /Header/DocumentNo"/>
                 <w:tag w:val="#Nav: Standard_Sales_Credit_Memo/1307"/>
-                <w:id w:val="-417795914"/>
+                <w:id w:val="-181209538"/>
                 <w:placeholder>
                   <w:docPart w:val="DefaultPlaceholder_-1854013440"/>
                 </w:placeholder>
-                <w:dataBinding w:prefixMappings="xmlns:ns0='urn:microsoft-dynamics-nav/reports/Standard_Sales_Credit_Memo/1307/'" w:xpath="/ns0:NavWordReportXmlPart[1]/ns0:Header[1]/ns0:District[1]" w:storeItemID="{CF06288A-A83B-4F49-BD2E-F2144A427321}"/>
+                <w:dataBinding w:prefixMappings="xmlns:ns0='urn:microsoft-dynamics-nav/reports/Standard_Sales_Credit_Memo/1307/'" w:xpath="/ns0:NavWordReportXmlPart[1]/ns0:Header[1]/ns0:DocumentNo[1]" w:storeItemID="{CF06288A-A83B-4F49-BD2E-F2144A427321}"/>
                 <w:text/>
               </w:sdtPr>
               <w:sdtEndPr/>
               <w:sdtContent>
+                <w:proofErr w:type="spellStart"/>
                 <w:r>
                   <w:rPr>
                     <w:b/>
                     <w:bCs/>
                   </w:rPr>
-                  <w:t>District</w:t>
+                  <w:t>DocumentNo</w:t>
                 </w:r>
+                <w:proofErr w:type="spellEnd"/>
+              </w:sdtContent>
+            </w:sdt>
+            <w:r>
+              <w:rPr>
+                <w:b/>
+                <w:bCs/>
+              </w:rPr>
+              <w:t xml:space="preserve"> </w:t>
+            </w:r>
+            <w:r>
+              <w:rPr>
+                <w:b/>
+                <w:bCs/>
+              </w:rPr>
+              <w:t xml:space="preserve"> </w:t>
+            </w:r>
+            <w:r>
+              <w:rPr>
+                <w:b/>
+                <w:bCs/>
+              </w:rPr>
+              <w:t>-</w:t>
+            </w:r>
+            <w:r>
+              <w:rPr>
+                <w:b/>
+                <w:bCs/>
+              </w:rPr>
+              <w:t xml:space="preserve">  </w:t>
+            </w:r>
+            <w:sdt>
+              <w:sdtPr>
+                <w:rPr>
+                  <w:b/>
+                  <w:bCs/>
+                </w:rPr>
+                <w:alias w:val="#Nav: /Header/CustomerNoLbl"/>
+                <w:tag w:val="#Nav: Standard_Sales_Credit_Memo/1307"/>
+                <w:id w:val="1473718510"/>
+                <w:placeholder>
+                  <w:docPart w:val="DefaultPlaceholder_-1854013440"/>
+                </w:placeholder>
+                <w:dataBinding w:prefixMappings="xmlns:ns0='urn:microsoft-dynamics-nav/reports/Standard_Sales_Credit_Memo/1307/'" w:xpath="/ns0:NavWordReportXmlPart[1]/ns0:Header[1]/ns0:CustomerNoLbl[1]" w:storeItemID="{CF06288A-A83B-4F49-BD2E-F2144A427321}"/>
+                <w:text/>
+              </w:sdtPr>
+              <w:sdtEndPr/>
+              <w:sdtContent>
+                <w:proofErr w:type="spellStart"/>
+                <w:r>
+                  <w:rPr>
+                    <w:b/>
+                    <w:bCs/>
+                  </w:rPr>
+                  <w:t>CustomerNoLbl</w:t>
+                </w:r>
+                <w:proofErr w:type="spellEnd"/>
+              </w:sdtContent>
+            </w:sdt>
+            <w:r>
+              <w:rPr>
+                <w:b/>
+                <w:bCs/>
+              </w:rPr>
+              <w:t xml:space="preserve"> </w:t>
+            </w:r>
+            <w:sdt>
+              <w:sdtPr>
+                <w:rPr>
+                  <w:b/>
+                  <w:bCs/>
+                </w:rPr>
+                <w:alias w:val="#Nav: /Header/SelltoCustomerNo"/>
+                <w:tag w:val="#Nav: Standard_Sales_Credit_Memo/1307"/>
+                <w:id w:val="-784498254"/>
+                <w:placeholder>
+                  <w:docPart w:val="DefaultPlaceholder_-1854013440"/>
+                </w:placeholder>
+                <w:dataBinding w:prefixMappings="xmlns:ns0='urn:microsoft-dynamics-nav/reports/Standard_Sales_Credit_Memo/1307/'" w:xpath="/ns0:NavWordReportXmlPart[1]/ns0:Header[1]/ns0:SelltoCustomerNo[1]" w:storeItemID="{CF06288A-A83B-4F49-BD2E-F2144A427321}"/>
+                <w:text/>
+              </w:sdtPr>
+              <w:sdtEndPr/>
+              <w:sdtContent>
+                <w:proofErr w:type="spellStart"/>
+                <w:r>
+                  <w:rPr>
+                    <w:b/>
+                    <w:bCs/>
+                  </w:rPr>
+                  <w:t>SelltoCustomerNo</w:t>
+                </w:r>
+                <w:proofErr w:type="spellEnd"/>
               </w:sdtContent>
             </w:sdt>
           </w:p>
@@ -99,10 +228,11 @@
     </w:tbl>
     <w:p>
       <w:pPr>
+        <w:tabs>
+          <w:tab w:val="left" w:pos="8292"/>
+        </w:tabs>
         <w:rPr>
-          <w:rFonts w:cstheme="minorHAnsi"/>
-          <w:b/>
-          <w:bCs/>
+          <w:lang w:val="en-US"/>
         </w:rPr>
       </w:pPr>
     </w:p>
@@ -273,15 +403,16 @@
               <w:b/>
               <w:bCs/>
             </w:rPr>
+            <w:alias w:val="#Nav: /Header/InvoiceDateLbl"/>
+            <w:tag w:val="#Nav: Standard_Sales_Credit_Memo/1307"/>
             <w:id w:val="1805429306"/>
             <w:placeholder>
               <w:docPart w:val="DefaultPlaceholder_-1854013440"/>
             </w:placeholder>
             <w:dataBinding w:prefixMappings="xmlns:ns0='urn:microsoft-dynamics-nav/reports/Standard_Sales_Credit_Memo/1307/'" w:xpath="/ns0:NavWordReportXmlPart[1]/ns0:Header[1]/ns0:InvoiceDateLbl[1]" w:storeItemID="{CF06288A-A83B-4F49-BD2E-F2144A427321}"/>
             <w:text/>
-            <w:alias w:val="#Nav: /Header/InvoiceDateLbl"/>
-            <w:tag w:val="#Nav: Standard_Sales_Credit_Memo/1307"/>
           </w:sdtPr>
+          <w:sdtEndPr/>
           <w:sdtContent>
             <w:tc>
               <w:tcPr>
@@ -696,13 +827,13 @@
               <w:b/>
               <w:bCs/>
             </w:rPr>
-            <w:alias w:val="#Nav: /Header/SelltoCustomerNo_Lbl"/>
+            <w:alias w:val="#Nav: /Header/CustomerNoLbl"/>
             <w:tag w:val="#Nav: Standard_Sales_Credit_Memo/1307"/>
-            <w:id w:val="-1403972463"/>
+            <w:id w:val="339285143"/>
             <w:placeholder>
               <w:docPart w:val="DefaultPlaceholder_-1854013440"/>
             </w:placeholder>
-            <w:dataBinding w:prefixMappings="xmlns:ns0='urn:microsoft-dynamics-nav/reports/Standard_Sales_Credit_Memo/1307/'" w:xpath="/ns0:NavWordReportXmlPart[1]/ns0:Header[1]/ns0:SelltoCustomerNo_Lbl[1]" w:storeItemID="{CF06288A-A83B-4F49-BD2E-F2144A427321}"/>
+            <w:dataBinding w:prefixMappings="xmlns:ns0='urn:microsoft-dynamics-nav/reports/Standard_Sales_Credit_Memo/1307/'" w:xpath="/ns0:NavWordReportXmlPart[1]/ns0:Header[1]/ns0:CustomerNoLbl[1]" w:storeItemID="{CF06288A-A83B-4F49-BD2E-F2144A427321}"/>
             <w:text/>
           </w:sdtPr>
           <w:sdtEndPr/>
@@ -724,7 +855,7 @@
                     <w:b/>
                     <w:bCs/>
                   </w:rPr>
-                  <w:t>SelltoCustomerNo_Lbl</w:t>
+                  <w:t>CustomerNoLbl</w:t>
                 </w:r>
                 <w:proofErr w:type="spellEnd"/>
               </w:p>
@@ -804,13 +935,13 @@
               <w:b/>
               <w:bCs/>
             </w:rPr>
-            <w:alias w:val="#Nav: /Header/Line/ItemNo_Line_Lbl"/>
+            <w:alias w:val="#Nav: /Header/Line/Description_Line_Lbl"/>
             <w:tag w:val="#Nav: Standard_Sales_Credit_Memo/1307"/>
-            <w:id w:val="627523510"/>
+            <w:id w:val="-1495717581"/>
             <w:placeholder>
-              <w:docPart w:val="223AF47FD5AE4DD2B6D2A7BD9B3B86F5"/>
+              <w:docPart w:val="DefaultPlaceholder_-1854013440"/>
             </w:placeholder>
-            <w:dataBinding w:prefixMappings="xmlns:ns0='urn:microsoft-dynamics-nav/reports/Standard_Sales_Credit_Memo/1307/'" w:xpath="/ns0:NavWordReportXmlPart[1]/ns0:Header[1]/ns0:Line[1]/ns0:ItemNo_Line_Lbl[1]" w:storeItemID="{CF06288A-A83B-4F49-BD2E-F2144A427321}"/>
+            <w:dataBinding w:prefixMappings="xmlns:ns0='urn:microsoft-dynamics-nav/reports/Standard_Sales_Credit_Memo/1307/'" w:xpath="/ns0:NavWordReportXmlPart[1]/ns0:Header[1]/ns0:Line[1]/ns0:Description_Line_Lbl[1]" w:storeItemID="{CF06288A-A83B-4F49-BD2E-F2144A427321}"/>
             <w:text/>
           </w:sdtPr>
           <w:sdtEndPr/>
@@ -833,7 +964,7 @@
                     <w:b/>
                     <w:bCs/>
                   </w:rPr>
-                  <w:t>ItemNo_Line_Lbl</w:t>
+                  <w:t>Description_Line_Lbl</w:t>
                 </w:r>
                 <w:proofErr w:type="spellEnd"/>
               </w:p>
@@ -1344,6 +1475,71 @@
         </w:rPr>
       </w:pPr>
     </w:p>
+    <w:p>
+      <w:pPr>
+        <w:rPr>
+          <w:rFonts w:cstheme="minorHAnsi"/>
+        </w:rPr>
+      </w:pPr>
+    </w:p>
+    <w:p>
+      <w:pPr>
+        <w:rPr>
+          <w:rFonts w:cstheme="minorHAnsi"/>
+        </w:rPr>
+      </w:pPr>
+    </w:p>
+    <w:p>
+      <w:pPr>
+        <w:rPr>
+          <w:rFonts w:cstheme="minorHAnsi"/>
+        </w:rPr>
+      </w:pPr>
+    </w:p>
+    <w:p>
+      <w:pPr>
+        <w:rPr>
+          <w:rFonts w:cstheme="minorHAnsi"/>
+        </w:rPr>
+      </w:pPr>
+    </w:p>
+    <w:p>
+      <w:pPr>
+        <w:rPr>
+          <w:rFonts w:cstheme="minorHAnsi"/>
+        </w:rPr>
+      </w:pPr>
+    </w:p>
+    <w:p>
+      <w:pPr>
+        <w:rPr>
+          <w:rFonts w:cstheme="minorHAnsi"/>
+        </w:rPr>
+      </w:pPr>
+    </w:p>
+    <w:p>
+      <w:pPr>
+        <w:rPr>
+          <w:rFonts w:cstheme="minorHAnsi"/>
+        </w:rPr>
+      </w:pPr>
+    </w:p>
+    <w:p>
+      <w:pPr>
+        <w:tabs>
+          <w:tab w:val="left" w:pos="1716"/>
+        </w:tabs>
+        <w:rPr>
+          <w:rFonts w:cstheme="minorHAnsi"/>
+        </w:rPr>
+      </w:pPr>
+      <w:r>
+        <w:rPr>
+          <w:rFonts w:cstheme="minorHAnsi"/>
+        </w:rPr>
+        <w:tab/>
+      </w:r>
+    </w:p>
     <w:sectPr>
       <w:headerReference w:type="default" r:id="rId7"/>
       <w:footerReference w:type="default" r:id="rId8"/>
@@ -1446,7 +1642,14 @@
             <w:t xml:space="preserve"> </w:t>
           </w:r>
           <w:r>
-            <w:t xml:space="preserve">● </w:t>
+            <w:rPr>
+              <w:b/>
+              <w:bCs/>
+            </w:rPr>
+            <w:t>*</w:t>
+          </w:r>
+          <w:r>
+            <w:t xml:space="preserve"> </w:t>
           </w:r>
           <w:sdt>
             <w:sdtPr>
@@ -1482,7 +1685,14 @@
             <w:t xml:space="preserve"> </w:t>
           </w:r>
           <w:r>
-            <w:t xml:space="preserve">● </w:t>
+            <w:rPr>
+              <w:b/>
+              <w:bCs/>
+            </w:rPr>
+            <w:t>*</w:t>
+          </w:r>
+          <w:r>
+            <w:t xml:space="preserve"> </w:t>
           </w:r>
           <w:sdt>
             <w:sdtPr>
@@ -1518,7 +1728,14 @@
             <w:t xml:space="preserve"> </w:t>
           </w:r>
           <w:r>
-            <w:t xml:space="preserve">● </w:t>
+            <w:rPr>
+              <w:b/>
+              <w:bCs/>
+            </w:rPr>
+            <w:t>*</w:t>
+          </w:r>
+          <w:r>
+            <w:t xml:space="preserve"> </w:t>
           </w:r>
           <w:sdt>
             <w:sdtPr>
@@ -1556,7 +1773,14 @@
             <w:t xml:space="preserve"> </w:t>
           </w:r>
           <w:r>
-            <w:t xml:space="preserve">● </w:t>
+            <w:rPr>
+              <w:b/>
+              <w:bCs/>
+            </w:rPr>
+            <w:t>*</w:t>
+          </w:r>
+          <w:r>
+            <w:t xml:space="preserve"> </w:t>
           </w:r>
           <w:sdt>
             <w:sdtPr>
@@ -1647,7 +1871,14 @@
             <w:t xml:space="preserve"> </w:t>
           </w:r>
           <w:r>
-            <w:t xml:space="preserve">● </w:t>
+            <w:rPr>
+              <w:b/>
+              <w:bCs/>
+            </w:rPr>
+            <w:t>*</w:t>
+          </w:r>
+          <w:r>
+            <w:t xml:space="preserve"> </w:t>
           </w:r>
           <w:sdt>
             <w:sdtPr>
@@ -1685,7 +1916,14 @@
             <w:t xml:space="preserve"> </w:t>
           </w:r>
           <w:r>
-            <w:t xml:space="preserve">● </w:t>
+            <w:rPr>
+              <w:b/>
+              <w:bCs/>
+            </w:rPr>
+            <w:t>*</w:t>
+          </w:r>
+          <w:r>
+            <w:t xml:space="preserve"> </w:t>
           </w:r>
           <w:sdt>
             <w:sdtPr>
@@ -1902,6 +2140,74 @@
           <w:tblGrid>
             <w:gridCol w:w="5969"/>
           </w:tblGrid>
+          <w:tr>
+            <w:tc>
+              <w:tcPr>
+                <w:tcW w:w="5969" w:type="dxa"/>
+              </w:tcPr>
+              <w:p>
+                <w:pPr>
+                  <w:pStyle w:val="Undertitel"/>
+                  <w:rPr>
+                    <w:rFonts w:cstheme="minorHAnsi"/>
+                    <w:b/>
+                    <w:szCs w:val="22"/>
+                  </w:rPr>
+                </w:pPr>
+              </w:p>
+            </w:tc>
+          </w:tr>
+          <w:tr>
+            <w:tc>
+              <w:tcPr>
+                <w:tcW w:w="5969" w:type="dxa"/>
+              </w:tcPr>
+              <w:p>
+                <w:pPr>
+                  <w:pStyle w:val="Undertitel"/>
+                  <w:rPr>
+                    <w:rFonts w:cstheme="minorHAnsi"/>
+                    <w:b/>
+                    <w:szCs w:val="22"/>
+                  </w:rPr>
+                </w:pPr>
+              </w:p>
+            </w:tc>
+          </w:tr>
+          <w:tr>
+            <w:tc>
+              <w:tcPr>
+                <w:tcW w:w="5969" w:type="dxa"/>
+              </w:tcPr>
+              <w:p>
+                <w:pPr>
+                  <w:pStyle w:val="Undertitel"/>
+                  <w:rPr>
+                    <w:rFonts w:cstheme="minorHAnsi"/>
+                    <w:b/>
+                    <w:szCs w:val="22"/>
+                  </w:rPr>
+                </w:pPr>
+              </w:p>
+            </w:tc>
+          </w:tr>
+          <w:tr>
+            <w:tc>
+              <w:tcPr>
+                <w:tcW w:w="5969" w:type="dxa"/>
+              </w:tcPr>
+              <w:p>
+                <w:pPr>
+                  <w:pStyle w:val="Undertitel"/>
+                  <w:rPr>
+                    <w:rFonts w:cstheme="minorHAnsi"/>
+                    <w:b/>
+                    <w:szCs w:val="22"/>
+                  </w:rPr>
+                </w:pPr>
+              </w:p>
+            </w:tc>
+          </w:tr>
           <w:tr>
             <w:sdt>
               <w:sdtPr>
@@ -2299,9 +2605,9 @@
                   <w:noProof/>
                 </w:rPr>
                 <w:drawing>
-                  <wp:inline distT="0" distB="0" distL="0" distR="0" wp14:anchorId="55A5B4E0" wp14:editId="5118DCA0">
-                    <wp:extent cx="1080000" cy="1080000"/>
-                    <wp:effectExtent l="0" t="0" r="6350" b="6350"/>
+                  <wp:inline distT="0" distB="0" distL="0" distR="0" wp14:anchorId="55A5B4E0" wp14:editId="1849D9EF">
+                    <wp:extent cx="1661929" cy="1661929"/>
+                    <wp:effectExtent l="0" t="0" r="0" b="0"/>
                     <wp:docPr id="1" name="Picture 2"/>
                     <wp:cNvGraphicFramePr>
                       <a:graphicFrameLocks xmlns:a="http://schemas.openxmlformats.org/drawingml/2006/main" noChangeAspect="1"/>
@@ -2324,7 +2630,7 @@
                           <pic:spPr bwMode="auto">
                             <a:xfrm>
                               <a:off x="0" y="0"/>
-                              <a:ext cx="1080000" cy="1080000"/>
+                              <a:ext cx="1661929" cy="1661929"/>
                             </a:xfrm>
                             <a:prstGeom prst="rect">
                               <a:avLst/>
@@ -3369,6 +3675,35 @@
         </w:p>
       </w:docPartBody>
     </w:docPart>
+    <w:docPart>
+      <w:docPartPr>
+        <w:name w:val="BB921F93711D447499A05E1D5CA62D39"/>
+        <w:category>
+          <w:name w:val="Generelt"/>
+          <w:gallery w:val="placeholder"/>
+        </w:category>
+        <w:types>
+          <w:type w:val="bbPlcHdr"/>
+        </w:types>
+        <w:behaviors>
+          <w:behavior w:val="content"/>
+        </w:behaviors>
+        <w:guid w:val="{3A66B9EB-0597-4DEF-BCE5-AE0DA05AACAC}"/>
+      </w:docPartPr>
+      <w:docPartBody>
+        <w:p>
+          <w:pPr>
+            <w:pStyle w:val="BB921F93711D447499A05E1D5CA62D39"/>
+          </w:pPr>
+          <w:r>
+            <w:rPr>
+              <w:rStyle w:val="Pladsholdertekst"/>
+            </w:rPr>
+            <w:t>Klik eller tryk her for at skrive tekst.</w:t>
+          </w:r>
+        </w:p>
+      </w:docPartBody>
+    </w:docPart>
   </w:docParts>
 </w:glossaryDocument>
 </file>
@@ -3424,13 +3759,16 @@
     <w:rsid w:val="00255A9F"/>
     <w:rsid w:val="00256F33"/>
     <w:rsid w:val="00307E11"/>
+    <w:rsid w:val="0033327C"/>
     <w:rsid w:val="0038084E"/>
     <w:rsid w:val="003973C9"/>
     <w:rsid w:val="003A4209"/>
+    <w:rsid w:val="00425783"/>
     <w:rsid w:val="00437F5A"/>
     <w:rsid w:val="004416DD"/>
     <w:rsid w:val="00491C0F"/>
     <w:rsid w:val="005268D8"/>
+    <w:rsid w:val="005D596F"/>
     <w:rsid w:val="00600949"/>
     <w:rsid w:val="00601856"/>
     <w:rsid w:val="006157DE"/>
@@ -3438,15 +3776,19 @@
     <w:rsid w:val="006C5C43"/>
     <w:rsid w:val="0070091E"/>
     <w:rsid w:val="0091179F"/>
+    <w:rsid w:val="0093077A"/>
     <w:rsid w:val="009569DA"/>
+    <w:rsid w:val="009A1F4F"/>
     <w:rsid w:val="009A6C53"/>
     <w:rsid w:val="00A52139"/>
     <w:rsid w:val="00B66BED"/>
+    <w:rsid w:val="00B85B31"/>
     <w:rsid w:val="00C55326"/>
     <w:rsid w:val="00C70E78"/>
     <w:rsid w:val="00CE71EC"/>
     <w:rsid w:val="00CF54AF"/>
     <w:rsid w:val="00CF6DF7"/>
+    <w:rsid w:val="00D1315D"/>
     <w:rsid w:val="00D16B12"/>
     <w:rsid w:val="00D530A7"/>
     <w:rsid w:val="00DC683D"/>
@@ -3456,6 +3798,7 @@
     <w:rsid w:val="00E905EF"/>
     <w:rsid w:val="00F51B79"/>
     <w:rsid w:val="00F66069"/>
+    <w:rsid w:val="00FC0BBE"/>
   </w:rsids>
   <m:mathPr>
     <m:mathFont m:val="Cambria Math"/>
@@ -3909,7 +4252,7 @@
     <w:basedOn w:val="Standardskrifttypeiafsnit"/>
     <w:uiPriority w:val="99"/>
     <w:semiHidden/>
-    <w:rsid w:val="00600949"/>
+    <w:rsid w:val="00B85B31"/>
     <w:rPr>
       <w:color w:val="808080"/>
     </w:rPr>
@@ -3965,6 +4308,10 @@
   <w:style w:type="paragraph" w:customStyle="1" w:styleId="2D7E0351908C45E4ACF2A4BBF06183D4">
     <w:name w:val="2D7E0351908C45E4ACF2A4BBF06183D4"/>
     <w:rsid w:val="00600949"/>
+  </w:style>
+  <w:style w:type="paragraph" w:customStyle="1" w:styleId="BB921F93711D447499A05E1D5CA62D39">
+    <w:name w:val="BB921F93711D447499A05E1D5CA62D39"/>
+    <w:rsid w:val="00B85B31"/>
   </w:style>
 </w:styles>
 </file>
@@ -4271,7 +4618,9 @@
 </a:theme>
 </file>
 
-<file path=customXml/item1.xml>��< ? x m l   v e r s i o n = " 1 . 0 "   e n c o d i n g = " u t f - 1 6 " ? > < N a v W o r d R e p o r t X m l P a r t   x m l n s = " u r n : m i c r o s o f t - d y n a m i c s - n a v / r e p o r t s / S t a n d a r d _ S a l e s _ C r e d i t _ M e m o / 1 3 0 7 / " > +<file path=customXml/item1.xml>��< ? x m l   v e r s i o n = " 1 . 0 "   e n c o d i n g = " u t f - 1 6 " ? > + 
+ < N a v W o r d R e p o r t X m l P a r t   x m l n s = " u r n : m i c r o s o f t - d y n a m i c s - n a v / r e p o r t s / S t a n d a r d _ S a l e s _ C r e d i t _ M e m o / 1 3 0 7 / " >   
      < H e a d e r >   
@@ -4391,6 +4740,8 @@
  
          < C u s t o m e r A d d r e s s 8 > C u s t o m e r A d d r e s s 8 < / C u s t o m e r A d d r e s s 8 >   
+         < C u s t o m e r N o L b l > C u s t o m e r N o L b l < / C u s t o m e r N o L b l > + 
          < C u s t o m e r P o s t a l B a r C o d e > C u s t o m e r P o s t a l B a r C o d e < / C u s t o m e r P o s t a l B a r C o d e >   
          < D e p a r t u r e D a t e > D e p a r t u r e D a t e < / D e p a r t u r e D a t e > @@ -4450,10 +4801,6 @@
          < L i n e A m o u n t L b l > L i n e A m o u n t L b l < / L i n e A m o u n t L b l >   
          < L o c a l C u r r e n c y _ L b l > L o c a l C u r r e n c y _ L b l < / L o c a l C u r r e n c y _ L b l > - 
-         < M e s s a g e L i n e 1 > M e s s a g e L i n e 1 < / M e s s a g e L i n e 1 > - 
-         < M e s s a g e L i n e 2 > M e s s a g e L i n e 2 < / M e s s a g e L i n e 2 >   
          < N a m e > N a m e < / N a m e >   

</xml_diff>